<commit_message>
OSCdef creation order - Volume cutoff
- OSCdef creation moved to last step (avoid error messages related to Synth that need to be created before OSCdef)
- Cut sound during calibration
- some cleanup
</commit_message>
<xml_diff>
--- a/T-Stick_FM_Setup.docx
+++ b/T-Stick_FM_Setup.docx
@@ -219,20 +219,147 @@
           <w:lang w:val="en-CA"/>
         </w:rPr>
       </w:pPr>
+      <w:r>
+        <w:rPr>
+          <w:lang w:val="en-CA"/>
+        </w:rPr>
+        <w:t xml:space="preserve">This patch doesn’t require </w:t>
+      </w:r>
+      <w:r>
+        <w:rPr>
+          <w:lang w:val="en-CA"/>
+        </w:rPr>
+        <w:t>any extension or Quark</w:t>
+      </w:r>
+    </w:p>
+    <w:p>
+      <w:pPr>
+        <w:pStyle w:val="UdeMTexteEspace"/>
+        <w:spacing w:before="240" w:after="120" w:line="240" w:lineRule="auto"/>
+        <w:rPr>
+          <w:b/>
+          <w:bCs/>
+          <w:lang w:val="en-CA"/>
+        </w:rPr>
+      </w:pPr>
+      <w:r>
+        <w:rPr>
+          <w:b/>
+          <w:bCs/>
+          <w:lang w:val="en-CA"/>
+        </w:rPr>
+        <w:t>Files</w:t>
+      </w:r>
+    </w:p>
+    <w:p>
+      <w:pPr>
+        <w:pStyle w:val="UdeMTexteEspace"/>
+        <w:numPr>
+          <w:ilvl w:val="0"/>
+          <w:numId w:val="19"/>
+        </w:numPr>
+        <w:spacing w:before="0" w:after="120" w:line="240" w:lineRule="auto"/>
+        <w:rPr>
+          <w:lang w:val="en-CA"/>
+        </w:rPr>
+      </w:pPr>
+      <w:r>
+        <w:rPr>
+          <w:i/>
+          <w:iCs/>
+          <w:lang w:val="en-CA"/>
+        </w:rPr>
+        <w:t>TStick-</w:t>
+      </w:r>
+      <w:r>
+        <w:rPr>
+          <w:i/>
+          <w:iCs/>
+          <w:lang w:val="en-CA"/>
+        </w:rPr>
+        <w:t>FM</w:t>
+      </w:r>
+      <w:r>
+        <w:rPr>
+          <w:i/>
+          <w:iCs/>
+          <w:lang w:val="en-CA"/>
+        </w:rPr>
+        <w:t>-Gen5.scd</w:t>
+      </w:r>
+      <w:r>
+        <w:rPr>
+          <w:lang w:val="en-CA"/>
+        </w:rPr>
+        <w:t>: SuperCollider patch.</w:t>
+      </w:r>
+    </w:p>
+    <w:p>
+      <w:pPr>
+        <w:pStyle w:val="UdeMTexteEspace"/>
+        <w:rPr>
+          <w:lang w:val="en-CA"/>
+        </w:rPr>
+      </w:pPr>
+    </w:p>
+    <w:p>
+      <w:pPr>
+        <w:pStyle w:val="UdeMTexteEspace"/>
+        <w:rPr>
+          <w:b/>
+          <w:u w:val="single"/>
+          <w:lang w:val="en-CA"/>
+        </w:rPr>
+      </w:pPr>
+      <w:r>
+        <w:rPr>
+          <w:b/>
+          <w:u w:val="single"/>
+          <w:lang w:val="en-CA"/>
+        </w:rPr>
+        <w:t>Preparatory steps</w:t>
+      </w:r>
+    </w:p>
+    <w:p>
+      <w:pPr>
+        <w:pStyle w:val="UdeMTexteEspace"/>
+        <w:rPr>
+          <w:bCs/>
+          <w:u w:val="single"/>
+          <w:lang w:val="en-CA"/>
+        </w:rPr>
+      </w:pPr>
+    </w:p>
+    <w:p>
+      <w:pPr>
+        <w:pStyle w:val="UdeMTexteEspace"/>
+        <w:numPr>
+          <w:ilvl w:val="0"/>
+          <w:numId w:val="20"/>
+        </w:numPr>
+        <w:spacing w:before="0" w:after="120" w:line="240" w:lineRule="auto"/>
+        <w:rPr>
+          <w:lang w:val="en-CA"/>
+        </w:rPr>
+      </w:pPr>
+      <w:r>
+        <w:rPr>
+          <w:lang w:val="en-CA"/>
+        </w:rPr>
+        <w:t xml:space="preserve">Follow the </w:t>
+      </w:r>
       <w:hyperlink r:id="rId9" w:history="1">
         <w:r>
           <w:rPr>
             <w:rStyle w:val="Lienhypertexte"/>
             <w:lang w:val="en-CA"/>
           </w:rPr>
-          <w:t>SC3 plugins</w:t>
+          <w:t>connection guide</w:t>
         </w:r>
       </w:hyperlink>
       <w:r>
         <w:rPr>
           <w:rStyle w:val="Lienhypertexte"/>
-          <w:color w:val="auto"/>
-          <w:u w:val="none"/>
           <w:lang w:val="en-CA"/>
         </w:rPr>
         <w:t xml:space="preserve"> </w:t>
@@ -241,109 +368,39 @@
         <w:rPr>
           <w:lang w:val="en-CA"/>
         </w:rPr>
-        <w:t>(ensure installation before starting)</w:t>
-      </w:r>
-      <w:r>
-        <w:rPr>
-          <w:lang w:val="en-CA"/>
-        </w:rPr>
-        <w:t xml:space="preserve"> TBC</w:t>
-      </w:r>
-    </w:p>
-    <w:p>
-      <w:pPr>
-        <w:pStyle w:val="UdeMTexteEspace"/>
-        <w:spacing w:before="240" w:after="120" w:line="240" w:lineRule="auto"/>
-        <w:rPr>
-          <w:b/>
-          <w:bCs/>
-        </w:rPr>
-      </w:pPr>
-      <w:r>
-        <w:rPr>
-          <w:b/>
-          <w:bCs/>
-        </w:rPr>
-        <w:t>Files</w:t>
+        <w:t>to update T-Stick to connect to the same WiFi network as your laptop</w:t>
+      </w:r>
+      <w:r>
+        <w:rPr>
+          <w:lang w:val="en-CA"/>
+        </w:rPr>
+        <w:t>. You will need to IP address of your computer on the network you’re connected to.</w:t>
       </w:r>
     </w:p>
     <w:p>
       <w:pPr>
         <w:pStyle w:val="UdeMTexteEspace"/>
         <w:numPr>
-          <w:ilvl w:val="0"/>
-          <w:numId w:val="19"/>
+          <w:ilvl w:val="1"/>
+          <w:numId w:val="20"/>
         </w:numPr>
         <w:spacing w:before="0" w:after="120" w:line="240" w:lineRule="auto"/>
-      </w:pPr>
-      <w:r>
-        <w:rPr>
-          <w:i/>
-          <w:iCs/>
-        </w:rPr>
-        <w:t>TStick-</w:t>
-      </w:r>
-      <w:r>
-        <w:rPr>
-          <w:i/>
-          <w:iCs/>
-        </w:rPr>
-        <w:t>FM</w:t>
-      </w:r>
-      <w:r>
-        <w:rPr>
-          <w:i/>
-          <w:iCs/>
-        </w:rPr>
-        <w:t>-Gen5.scd</w:t>
-      </w:r>
-      <w:r>
-        <w:t xml:space="preserve">: </w:t>
-      </w:r>
-      <w:proofErr w:type="spellStart"/>
-      <w:r>
-        <w:t>SuperCollider</w:t>
-      </w:r>
-      <w:proofErr w:type="spellEnd"/>
-      <w:r>
-        <w:t xml:space="preserve"> patch.</w:t>
-      </w:r>
-    </w:p>
-    <w:p>
-      <w:pPr>
-        <w:pStyle w:val="UdeMTexteEspace"/>
-        <w:rPr>
-          <w:lang w:val="en-CA"/>
-        </w:rPr>
-      </w:pPr>
-    </w:p>
-    <w:p>
-      <w:pPr>
-        <w:pStyle w:val="UdeMTexteEspace"/>
-        <w:rPr>
-          <w:b/>
-          <w:u w:val="single"/>
-          <w:lang w:val="en-CA"/>
-        </w:rPr>
-      </w:pPr>
-      <w:r>
-        <w:rPr>
-          <w:b/>
-          <w:u w:val="single"/>
-          <w:lang w:val="en-CA"/>
-        </w:rPr>
-        <w:t>Preparatory steps</w:t>
-      </w:r>
-    </w:p>
-    <w:p>
-      <w:pPr>
-        <w:pStyle w:val="UdeMTexteEspace"/>
-        <w:rPr>
-          <w:bCs/>
-          <w:u w:val="single"/>
-          <w:lang w:val="en-CA"/>
-        </w:rPr>
-      </w:pPr>
+        <w:rPr>
+          <w:lang w:val="en-CA"/>
+        </w:rPr>
+      </w:pPr>
+      <w:r>
+        <w:rPr>
+          <w:lang w:val="en-CA"/>
+        </w:rPr>
+        <w:t>Either create a Wireless access point (hotspot) or use a dedicated router</w:t>
+      </w:r>
+      <w:r>
+        <w:rPr>
+          <w:lang w:val="en-CA"/>
+        </w:rPr>
+        <w:t xml:space="preserve"> (it is not recommended to rely on a public WiFi network)</w:t>
+      </w:r>
     </w:p>
     <w:p>
       <w:pPr>
@@ -361,63 +418,49 @@
         <w:rPr>
           <w:lang w:val="en-CA"/>
         </w:rPr>
-        <w:t xml:space="preserve">Follow the </w:t>
-      </w:r>
-      <w:hyperlink r:id="rId10" w:history="1">
-        <w:r>
-          <w:rPr>
-            <w:rStyle w:val="Lienhypertexte"/>
-            <w:lang w:val="en-CA"/>
-          </w:rPr>
-          <w:t>connection</w:t>
-        </w:r>
-        <w:r>
-          <w:rPr>
-            <w:rStyle w:val="Lienhypertexte"/>
-            <w:lang w:val="en-CA"/>
-          </w:rPr>
-          <w:t xml:space="preserve"> </w:t>
-        </w:r>
-        <w:r>
-          <w:rPr>
-            <w:rStyle w:val="Lienhypertexte"/>
-            <w:lang w:val="en-CA"/>
-          </w:rPr>
-          <w:t>guide</w:t>
-        </w:r>
-      </w:hyperlink>
-      <w:r>
-        <w:rPr>
-          <w:rStyle w:val="Lienhypertexte"/>
-          <w:lang w:val="en-CA"/>
-        </w:rPr>
-        <w:t xml:space="preserve"> </w:t>
-      </w:r>
-      <w:r>
-        <w:rPr>
-          <w:lang w:val="en-CA"/>
-        </w:rPr>
-        <w:t xml:space="preserve">to update T-Stick to connect to the same </w:t>
-      </w:r>
-      <w:proofErr w:type="spellStart"/>
-      <w:r>
-        <w:rPr>
-          <w:lang w:val="en-CA"/>
-        </w:rPr>
-        <w:t>WiFi</w:t>
-      </w:r>
-      <w:proofErr w:type="spellEnd"/>
-      <w:r>
-        <w:rPr>
-          <w:lang w:val="en-CA"/>
-        </w:rPr>
-        <w:t xml:space="preserve"> network as your laptop</w:t>
-      </w:r>
-      <w:r>
-        <w:rPr>
-          <w:lang w:val="en-CA"/>
-        </w:rPr>
-        <w:t>. You will need to IP address of your computer on the network you’re connected to.</w:t>
+        <w:t>The patch requires a basic knowledge of Supercollider</w:t>
+      </w:r>
+      <w:r>
+        <w:rPr>
+          <w:lang w:val="en-CA"/>
+        </w:rPr>
+        <w:t xml:space="preserve">. </w:t>
+      </w:r>
+      <w:r>
+        <w:rPr>
+          <w:lang w:val="en-CA"/>
+        </w:rPr>
+        <w:t xml:space="preserve">In file </w:t>
+      </w:r>
+      <w:r>
+        <w:rPr>
+          <w:i/>
+          <w:iCs/>
+          <w:lang w:val="en-CA"/>
+        </w:rPr>
+        <w:t>TStick-</w:t>
+      </w:r>
+      <w:r>
+        <w:rPr>
+          <w:i/>
+          <w:iCs/>
+          <w:lang w:val="en-CA"/>
+        </w:rPr>
+        <w:t>FM</w:t>
+      </w:r>
+      <w:r>
+        <w:rPr>
+          <w:i/>
+          <w:iCs/>
+          <w:lang w:val="en-CA"/>
+        </w:rPr>
+        <w:t>-Gen5.scd</w:t>
+      </w:r>
+      <w:r>
+        <w:rPr>
+          <w:lang w:val="en-CA"/>
+        </w:rPr>
+        <w:t>:</w:t>
       </w:r>
     </w:p>
     <w:p>
@@ -436,100 +479,37 @@
         <w:rPr>
           <w:lang w:val="en-CA"/>
         </w:rPr>
-        <w:t>Either create a Wireless access point (hotspot) or use a dedicated router</w:t>
-      </w:r>
-      <w:r>
-        <w:rPr>
-          <w:lang w:val="en-CA"/>
-        </w:rPr>
-        <w:t xml:space="preserve"> (i</w:t>
-      </w:r>
-      <w:r>
-        <w:rPr>
-          <w:lang w:val="en-CA"/>
-        </w:rPr>
-        <w:t xml:space="preserve">t is not recommended to rely on a public </w:t>
-      </w:r>
-      <w:proofErr w:type="spellStart"/>
-      <w:r>
-        <w:rPr>
-          <w:lang w:val="en-CA"/>
-        </w:rPr>
-        <w:t>WiFi</w:t>
-      </w:r>
-      <w:proofErr w:type="spellEnd"/>
-      <w:r>
-        <w:rPr>
-          <w:lang w:val="en-CA"/>
-        </w:rPr>
-        <w:t xml:space="preserve"> network</w:t>
+        <w:t>Select output device</w:t>
+      </w:r>
+      <w:r>
+        <w:rPr>
+          <w:lang w:val="en-CA"/>
+        </w:rPr>
+        <w:t xml:space="preserve">. </w:t>
+      </w:r>
+      <w:r>
+        <w:rPr>
+          <w:lang w:val="en-CA"/>
+        </w:rPr>
+        <w:t>If you’re using an external soundcard select the corresponding ASIO driver</w:t>
+      </w:r>
+      <w:r>
+        <w:rPr>
+          <w:lang w:val="en-CA"/>
+        </w:rPr>
+        <w:t xml:space="preserve"> (</w:t>
+      </w:r>
+      <w:r>
+        <w:rPr>
+          <w:lang w:val="en-CA"/>
+        </w:rPr>
+        <w:t>On Windows, WASAPI is recommended</w:t>
       </w:r>
       <w:r>
         <w:rPr>
           <w:lang w:val="en-CA"/>
         </w:rPr>
         <w:t>)</w:t>
-      </w:r>
-    </w:p>
-    <w:p>
-      <w:pPr>
-        <w:pStyle w:val="UdeMTexteEspace"/>
-        <w:numPr>
-          <w:ilvl w:val="0"/>
-          <w:numId w:val="20"/>
-        </w:numPr>
-        <w:spacing w:before="0" w:after="120" w:line="240" w:lineRule="auto"/>
-        <w:rPr>
-          <w:lang w:val="en-CA"/>
-        </w:rPr>
-      </w:pPr>
-      <w:r>
-        <w:rPr>
-          <w:lang w:val="en-CA"/>
-        </w:rPr>
-        <w:t>The patch requires a basic knowledge of Supercollider</w:t>
-      </w:r>
-      <w:r>
-        <w:rPr>
-          <w:lang w:val="en-CA"/>
-        </w:rPr>
-        <w:t xml:space="preserve">. </w:t>
-      </w:r>
-      <w:r>
-        <w:rPr>
-          <w:lang w:val="en-CA"/>
-        </w:rPr>
-        <w:t xml:space="preserve">In file </w:t>
-      </w:r>
-      <w:r>
-        <w:rPr>
-          <w:i/>
-          <w:iCs/>
-          <w:lang w:val="en-CA"/>
-        </w:rPr>
-        <w:t>TStick-</w:t>
-      </w:r>
-      <w:r>
-        <w:rPr>
-          <w:i/>
-          <w:iCs/>
-          <w:lang w:val="en-CA"/>
-        </w:rPr>
-        <w:t>FM</w:t>
-      </w:r>
-      <w:r>
-        <w:rPr>
-          <w:i/>
-          <w:iCs/>
-          <w:lang w:val="en-CA"/>
-        </w:rPr>
-        <w:t>-Gen5.scd</w:t>
-      </w:r>
-      <w:r>
-        <w:rPr>
-          <w:lang w:val="en-CA"/>
-        </w:rPr>
-        <w:t>:</w:t>
       </w:r>
     </w:p>
     <w:p>
@@ -548,37 +528,7 @@
         <w:rPr>
           <w:lang w:val="en-CA"/>
         </w:rPr>
-        <w:t>Select output device</w:t>
-      </w:r>
-      <w:r>
-        <w:rPr>
-          <w:lang w:val="en-CA"/>
-        </w:rPr>
-        <w:t xml:space="preserve">. </w:t>
-      </w:r>
-      <w:r>
-        <w:rPr>
-          <w:lang w:val="en-CA"/>
-        </w:rPr>
-        <w:t>If you’re using an external soundcard select the corresponding ASIO driver</w:t>
-      </w:r>
-      <w:r>
-        <w:rPr>
-          <w:lang w:val="en-CA"/>
-        </w:rPr>
-        <w:t xml:space="preserve"> (</w:t>
-      </w:r>
-      <w:r>
-        <w:rPr>
-          <w:lang w:val="en-CA"/>
-        </w:rPr>
-        <w:t>On Windows, WASAPI is recommended</w:t>
-      </w:r>
-      <w:r>
-        <w:rPr>
-          <w:lang w:val="en-CA"/>
-        </w:rPr>
-        <w:t>)</w:t>
+        <w:t>If the chosen device is not found, SC will boot using system’s default device</w:t>
       </w:r>
     </w:p>
     <w:p>
@@ -597,25 +547,6 @@
         <w:rPr>
           <w:lang w:val="en-CA"/>
         </w:rPr>
-        <w:t>If the chosen device is not found, SC will boot using system’s default device</w:t>
-      </w:r>
-    </w:p>
-    <w:p>
-      <w:pPr>
-        <w:pStyle w:val="UdeMTexteEspace"/>
-        <w:numPr>
-          <w:ilvl w:val="1"/>
-          <w:numId w:val="20"/>
-        </w:numPr>
-        <w:spacing w:before="0" w:after="120" w:line="240" w:lineRule="auto"/>
-        <w:rPr>
-          <w:lang w:val="en-CA"/>
-        </w:rPr>
-      </w:pPr>
-      <w:r>
-        <w:rPr>
-          <w:lang w:val="en-CA"/>
-        </w:rPr>
         <w:t xml:space="preserve">The list of drivers / device </w:t>
       </w:r>
       <w:r>
@@ -662,6 +593,7 @@
       <w:r>
         <w:rPr>
           <w:noProof/>
+          <w:lang w:val="en-CA"/>
         </w:rPr>
         <w:drawing>
           <wp:inline distT="0" distB="0" distL="0" distR="0" wp14:anchorId="738E450B" wp14:editId="44516CA4">
@@ -679,7 +611,7 @@
                     <pic:cNvPicPr/>
                   </pic:nvPicPr>
                   <pic:blipFill>
-                    <a:blip r:embed="rId11"/>
+                    <a:blip r:embed="rId10"/>
                     <a:stretch>
                       <a:fillRect/>
                     </a:stretch>
@@ -734,13 +666,7 @@
         <w:rPr>
           <w:lang w:val="en-CA"/>
         </w:rPr>
-        <w:t>name of T-Stick to global variable</w:t>
-      </w:r>
-      <w:r>
-        <w:rPr>
-          <w:lang w:val="en-CA"/>
-        </w:rPr>
-        <w:t xml:space="preserve"> </w:t>
+        <w:t xml:space="preserve">name of T-Stick to global variable </w:t>
       </w:r>
       <w:r>
         <w:rPr>
@@ -748,62 +674,28 @@
           <w:iCs/>
           <w:lang w:val="en-CA"/>
         </w:rPr>
-        <w:t>~</w:t>
-      </w:r>
-      <w:proofErr w:type="spellStart"/>
+        <w:t>~tStick</w:t>
+      </w:r>
+      <w:r>
+        <w:rPr>
+          <w:lang w:val="en-CA"/>
+        </w:rPr>
+        <w:t xml:space="preserve"> and </w:t>
+      </w:r>
+      <w:r>
+        <w:rPr>
+          <w:lang w:val="en-CA"/>
+        </w:rPr>
+        <w:t xml:space="preserve">value of the port to which the T-Stick will send data to global variable </w:t>
+      </w:r>
       <w:r>
         <w:rPr>
           <w:i/>
           <w:iCs/>
           <w:lang w:val="en-CA"/>
         </w:rPr>
-        <w:t>t</w:t>
-      </w:r>
-      <w:r>
-        <w:rPr>
-          <w:i/>
-          <w:iCs/>
-          <w:lang w:val="en-CA"/>
-        </w:rPr>
-        <w:t>Stick</w:t>
-      </w:r>
-      <w:proofErr w:type="spellEnd"/>
-      <w:r>
-        <w:rPr>
-          <w:lang w:val="en-CA"/>
-        </w:rPr>
-        <w:t xml:space="preserve"> </w:t>
-      </w:r>
-      <w:r>
-        <w:rPr>
-          <w:lang w:val="en-CA"/>
-        </w:rPr>
-        <w:t xml:space="preserve">and </w:t>
-      </w:r>
-      <w:r>
-        <w:rPr>
-          <w:lang w:val="en-CA"/>
-        </w:rPr>
-        <w:t xml:space="preserve">value of the port to which the T-Stick will send data to global variable </w:t>
-      </w:r>
-      <w:r>
-        <w:rPr>
-          <w:i/>
-          <w:iCs/>
-          <w:lang w:val="en-CA"/>
-        </w:rPr>
-        <w:t>~</w:t>
-      </w:r>
-      <w:proofErr w:type="spellStart"/>
-      <w:r>
-        <w:rPr>
-          <w:i/>
-          <w:iCs/>
-          <w:lang w:val="en-CA"/>
-        </w:rPr>
-        <w:t>recvPort</w:t>
-      </w:r>
-      <w:proofErr w:type="spellEnd"/>
+        <w:t>~recvPort</w:t>
+      </w:r>
     </w:p>
     <w:p>
       <w:pPr>
@@ -816,6 +708,7 @@
       <w:r>
         <w:rPr>
           <w:noProof/>
+          <w:lang w:val="en-CA"/>
         </w:rPr>
         <w:drawing>
           <wp:inline distT="0" distB="0" distL="0" distR="0" wp14:anchorId="3A2D7EE3" wp14:editId="7D75B60A">
@@ -833,7 +726,7 @@
                     <pic:cNvPicPr/>
                   </pic:nvPicPr>
                   <pic:blipFill>
-                    <a:blip r:embed="rId12"/>
+                    <a:blip r:embed="rId11"/>
                     <a:stretch>
                       <a:fillRect/>
                     </a:stretch>
@@ -1018,21 +911,7 @@
         <w:rPr>
           <w:lang w:val="en-CA"/>
         </w:rPr>
-        <w:t xml:space="preserve"> to avoid losing </w:t>
-      </w:r>
-      <w:proofErr w:type="spellStart"/>
-      <w:r>
-        <w:rPr>
-          <w:lang w:val="en-CA"/>
-        </w:rPr>
-        <w:t>WiFi</w:t>
-      </w:r>
-      <w:proofErr w:type="spellEnd"/>
-      <w:r>
-        <w:rPr>
-          <w:lang w:val="en-CA"/>
-        </w:rPr>
-        <w:t xml:space="preserve"> connection</w:t>
+        <w:t xml:space="preserve"> to avoid losing WiFi connection</w:t>
       </w:r>
       <w:r>
         <w:rPr>
@@ -1136,18 +1015,8 @@
           <w:bCs/>
           <w:lang w:val="en-CA"/>
         </w:rPr>
-        <w:t xml:space="preserve">Start </w:t>
-      </w:r>
-      <w:proofErr w:type="spellStart"/>
-      <w:r>
-        <w:rPr>
-          <w:b/>
-          <w:bCs/>
-          <w:lang w:val="en-CA"/>
-        </w:rPr>
-        <w:t>SuperCollider</w:t>
-      </w:r>
-      <w:proofErr w:type="spellEnd"/>
+        <w:t>Start SuperCollider</w:t>
+      </w:r>
     </w:p>
     <w:p>
       <w:pPr>
@@ -1165,16 +1034,8 @@
         <w:rPr>
           <w:lang w:val="en-CA"/>
         </w:rPr>
-        <w:t xml:space="preserve">Launch </w:t>
-      </w:r>
-      <w:proofErr w:type="spellStart"/>
-      <w:r>
-        <w:rPr>
-          <w:lang w:val="en-CA"/>
-        </w:rPr>
-        <w:t>SuperCollider</w:t>
-      </w:r>
-      <w:proofErr w:type="spellEnd"/>
+        <w:t>Launch SuperCollider</w:t>
+      </w:r>
       <w:r>
         <w:rPr>
           <w:lang w:val="en-CA"/>
@@ -1185,13 +1046,7 @@
         <w:rPr>
           <w:lang w:val="en-CA"/>
         </w:rPr>
-        <w:t>open</w:t>
-      </w:r>
-      <w:r>
-        <w:rPr>
-          <w:lang w:val="en-CA"/>
-        </w:rPr>
-        <w:t xml:space="preserve"> </w:t>
+        <w:t xml:space="preserve">open </w:t>
       </w:r>
       <w:r>
         <w:rPr>
@@ -1349,27 +1204,7 @@
         <w:rPr>
           <w:lang w:val="en-CA"/>
         </w:rPr>
-        <w:t xml:space="preserve">These are the steps </w:t>
-      </w:r>
-      <w:proofErr w:type="spellStart"/>
-      <w:r>
-        <w:rPr>
-          <w:lang w:val="en-CA"/>
-        </w:rPr>
-        <w:t>reconmme</w:t>
-      </w:r>
-      <w:r>
-        <w:rPr>
-          <w:lang w:val="en-CA"/>
-        </w:rPr>
-        <w:t>nded</w:t>
-      </w:r>
-      <w:proofErr w:type="spellEnd"/>
-      <w:r>
-        <w:rPr>
-          <w:lang w:val="en-CA"/>
-        </w:rPr>
-        <w:t xml:space="preserve"> for concert setup</w:t>
+        <w:t>These are the steps reconmmended for concert setup</w:t>
       </w:r>
     </w:p>
     <w:p>
@@ -1379,19 +1214,10 @@
           <w:lang w:val="en-CA"/>
         </w:rPr>
       </w:pPr>
-    </w:p>
-    <w:p>
-      <w:pPr>
-        <w:pStyle w:val="UdeMTexteEspace"/>
-        <w:rPr>
-          <w:lang w:val="en-CA"/>
-        </w:rPr>
-      </w:pPr>
-      <w:r>
-        <w:rPr>
-          <w:lang w:val="en-CA"/>
-        </w:rPr>
-        <w:lastRenderedPageBreak/>
+      <w:r>
+        <w:rPr>
+          <w:lang w:val="en-CA"/>
+        </w:rPr>
         <w:t xml:space="preserve">Volume may be adapted with the volume GUI if lack of other volume control </w:t>
       </w:r>
     </w:p>

</xml_diff>

<commit_message>
Added old Synth management (prevent unfreed synth accumulation)
Create 3 groups inside Main group, where Synth are played
Each time Group n is "full" (default max 32 Synth in each group), move to group n+1, forcefully freeAll synth in group n-1.
Moved modulation synth in dedicated group
</commit_message>
<xml_diff>
--- a/T-Stick_FM_Setup.docx
+++ b/T-Stick_FM_Setup.docx
@@ -223,13 +223,7 @@
         <w:rPr>
           <w:lang w:val="en-CA"/>
         </w:rPr>
-        <w:t xml:space="preserve">This patch doesn’t require </w:t>
-      </w:r>
-      <w:r>
-        <w:rPr>
-          <w:lang w:val="en-CA"/>
-        </w:rPr>
-        <w:t>any extension or Quark</w:t>
+        <w:t>It is recommended to install the safety net quark….</w:t>
       </w:r>
     </w:p>
     <w:p>

</xml_diff>